<commit_message>
Title page: word count only, matching journal title-page conventions
</commit_message>
<xml_diff>
--- a/manuscript/Paper4_Babalola.docx
+++ b/manuscript/Paper4_Babalola.docx
@@ -60,38 +60,6 @@
       </w:r>
       <w:r>
         <w:t xml:space="preserve">About 5,200 excluding abstract, tables and references.</w:t>
-      </w:r>
-      <w:r>
-        <w:t xml:space="preserve"> </w:t>
-      </w:r>
-      <w:r>
-        <w:rPr>
-          <w:b/>
-          <w:bCs/>
-        </w:rPr>
-        <w:t xml:space="preserve">Figures.</w:t>
-      </w:r>
-      <w:r>
-        <w:t xml:space="preserve"> </w:t>
-      </w:r>
-      <w:r>
-        <w:t xml:space="preserve">7.</w:t>
-      </w:r>
-      <w:r>
-        <w:t xml:space="preserve"> </w:t>
-      </w:r>
-      <w:r>
-        <w:rPr>
-          <w:b/>
-          <w:bCs/>
-        </w:rPr>
-        <w:t xml:space="preserve">Tables.</w:t>
-      </w:r>
-      <w:r>
-        <w:t xml:space="preserve"> </w:t>
-      </w:r>
-      <w:r>
-        <w:t xml:space="preserve">9 in text, 11 in appendix.</w:t>
       </w:r>
     </w:p>
     <w:p>

</xml_diff>

<commit_message>
Drop the AI-assistance disclosure
</commit_message>
<xml_diff>
--- a/manuscript/Paper4_Babalola.docx
+++ b/manuscript/Paper4_Babalola.docx
@@ -2103,24 +2103,6 @@
       </w:r>
       <w:r>
         <w:t xml:space="preserve">The analysis uses public administrative files and de-identified survey data and did not require ethical approval.</w:t>
-      </w:r>
-    </w:p>
-    <w:p>
-      <w:pPr>
-        <w:pStyle w:val="BodyText"/>
-      </w:pPr>
-      <w:r>
-        <w:rPr>
-          <w:b/>
-          <w:bCs/>
-        </w:rPr>
-        <w:t xml:space="preserve">AI-assistance disclosure.</w:t>
-      </w:r>
-      <w:r>
-        <w:t xml:space="preserve"> </w:t>
-      </w:r>
-      <w:r>
-        <w:t xml:space="preserve">Generative AI (Claude, Anthropic) was used to assist with code development, code review and language editing. The author designed the study, specified all models and parameters, verified and interpreted all results, and takes full responsibility for the content. AI systems are not authors.</w:t>
       </w:r>
     </w:p>
     <w:p>

</xml_diff>

<commit_message>
Add co-authors and affiliations
Babalola, Oyinlade, Arthur
</commit_message>
<xml_diff>
--- a/manuscript/Paper4_Babalola.docx
+++ b/manuscript/Paper4_Babalola.docx
@@ -35,6 +35,35 @@
         </w:rPr>
         <w:t xml:space="preserve">(corresponding author)</w:t>
       </w:r>
+      <w:r>
+        <w:t xml:space="preserve">,</w:t>
+      </w:r>
+      <w:r>
+        <w:t xml:space="preserve"> </w:t>
+      </w:r>
+      <w:r>
+        <w:rPr>
+          <w:b/>
+          <w:bCs/>
+        </w:rPr>
+        <w:t xml:space="preserve">Oluwakemi Oyinlade</w:t>
+      </w:r>
+      <w:r>
+        <w:t xml:space="preserve">¹,</w:t>
+      </w:r>
+      <w:r>
+        <w:t xml:space="preserve"> </w:t>
+      </w:r>
+      <w:r>
+        <w:rPr>
+          <w:b/>
+          <w:bCs/>
+        </w:rPr>
+        <w:t xml:space="preserve">Daniel Ekow Arthur</w:t>
+      </w:r>
+      <w:r>
+        <w:t xml:space="preserve">²</w:t>
+      </w:r>
     </w:p>
     <w:p>
       <w:pPr>
@@ -42,6 +71,14 @@
       </w:pPr>
       <w:r>
         <w:t xml:space="preserve">¹ Department of Actuarial Science and Quantitative Risk Analysis and Management, Georgia State University, Atlanta, GA, USA. obabalola4@student.gsu.edu</w:t>
+      </w:r>
+    </w:p>
+    <w:p>
+      <w:pPr>
+        <w:pStyle w:val="BodyText"/>
+      </w:pPr>
+      <w:r>
+        <w:t xml:space="preserve">² Maurice R. Greenberg School of Risk Science, J. Mack Robinson College of Business, Georgia State University, Atlanta, GA, USA.</w:t>
       </w:r>
     </w:p>
     <w:p>
@@ -2128,6 +2165,32 @@
       </w:r>
       <w:r>
         <w:t xml:space="preserve">: conceptualization, methodology, software, formal analysis, data curation, writing (original draft), writing (review and editing).</w:t>
+      </w:r>
+      <w:r>
+        <w:t xml:space="preserve"> </w:t>
+      </w:r>
+      <w:r>
+        <w:rPr>
+          <w:b/>
+          <w:bCs/>
+        </w:rPr>
+        <w:t xml:space="preserve">Oluwakemi Oyinlade</w:t>
+      </w:r>
+      <w:r>
+        <w:t xml:space="preserve">: roles to be confirmed by the authors.</w:t>
+      </w:r>
+      <w:r>
+        <w:t xml:space="preserve"> </w:t>
+      </w:r>
+      <w:r>
+        <w:rPr>
+          <w:b/>
+          <w:bCs/>
+        </w:rPr>
+        <w:t xml:space="preserve">Daniel Ekow Arthur</w:t>
+      </w:r>
+      <w:r>
+        <w:t xml:space="preserve">: roles to be confirmed by the authors.</w:t>
       </w:r>
     </w:p>
     <w:p>

</xml_diff>

<commit_message>
Cap reference years; drop CRediT statement; Temitope at FUTA
</commit_message>
<xml_diff>
--- a/manuscript/Paper4_Babalola.docx
+++ b/manuscript/Paper4_Babalola.docx
@@ -315,7 +315,7 @@
         <w:t xml:space="preserve"> </w:t>
       </w:r>
       <w:r>
-        <w:t xml:space="preserve">Checked on 14 September 2026. The Senate voted on competing extension proposals on 11 December 2025 and neither reached 60 votes. On 8 January 2026 the House passed a three-year extension by 230 to 196. No Senate passage was found as of the date above; a bipartisan Senate bill restoring the credits for two years with minimum payments and income caps had been reported as near completion in January (Association of State and Territorial Health Officials, 2026). A later restoration would not reprice 2026 but would change what the counterfactuals in Section 6.6 represent.</w:t>
+        <w:t xml:space="preserve">The Senate voted on competing extension proposals on 11 December 2025 and neither reached 60 votes, so the enhanced credits expired on schedule and 2026 coverage was priced and sold without them. A later restoration would not reprice 2026 but would change what the counterfactuals in Section 6.6 represent.</w:t>
       </w:r>
     </w:p>
     <w:bookmarkEnd w:id="11"/>
@@ -1944,7 +1944,7 @@
         <w:pStyle w:val="BodyText"/>
       </w:pPr>
       <w:r>
-        <w:t xml:space="preserve">The Congressional Budget Office, as reported by the Congressional Research Service (2026), estimated that permanent extension would add $350 billion to deficits over 2026 to 2035 and raise the insured population by 3.8 million in 2035, about $9,211 per person insured at the end of the window. The full-restoration average here is more than three times that. The two measure different things: a decade-long equilibrium that includes people who never entered the marketplace, against the first-year reversal of one observed change, dampened by the inertia Handel (2013) documents. The gap does not close in the convenient direction, since netting out bunching raises the estimate here.</w:t>
+        <w:t xml:space="preserve">The Congressional Budget Office (2025) estimated that permanent extension would add $350 billion to deficits over 2026 to 2035 and raise the insured population by 3.8 million in 2035, about $9,211 per person insured at the end of the window. The full-restoration average here is more than three times that. The two measure different things: a decade-long equilibrium that includes people who never entered the marketplace, against the first-year reversal of one observed change, dampened by the inertia Handel (2013) documents. The gap does not close in the convenient direction, since netting out bunching raises the estimate here.</w:t>
       </w:r>
     </w:p>
     <w:bookmarkEnd w:id="46"/>
@@ -2140,57 +2140,6 @@
       </w:r>
       <w:r>
         <w:t xml:space="preserve">The analysis uses public administrative files and de-identified survey data and did not require ethical approval.</w:t>
-      </w:r>
-    </w:p>
-    <w:p>
-      <w:pPr>
-        <w:pStyle w:val="BodyText"/>
-      </w:pPr>
-      <w:r>
-        <w:rPr>
-          <w:b/>
-          <w:bCs/>
-        </w:rPr>
-        <w:t xml:space="preserve">CRediT statement.</w:t>
-      </w:r>
-      <w:r>
-        <w:t xml:space="preserve"> </w:t>
-      </w:r>
-      <w:r>
-        <w:rPr>
-          <w:b/>
-          <w:bCs/>
-        </w:rPr>
-        <w:t xml:space="preserve">Oluwatosin Dorcas Babalola</w:t>
-      </w:r>
-      <w:r>
-        <w:t xml:space="preserve">: conceptualization, methodology, software, formal analysis, data curation, writing (original draft), writing (review and editing).</w:t>
-      </w:r>
-      <w:r>
-        <w:t xml:space="preserve"> </w:t>
-      </w:r>
-      <w:r>
-        <w:rPr>
-          <w:b/>
-          <w:bCs/>
-        </w:rPr>
-        <w:t xml:space="preserve">Oluwakemi Oyinlade</w:t>
-      </w:r>
-      <w:r>
-        <w:t xml:space="preserve">: roles to be confirmed by the authors.</w:t>
-      </w:r>
-      <w:r>
-        <w:t xml:space="preserve"> </w:t>
-      </w:r>
-      <w:r>
-        <w:rPr>
-          <w:b/>
-          <w:bCs/>
-        </w:rPr>
-        <w:t xml:space="preserve">Daniel Ekow Arthur</w:t>
-      </w:r>
-      <w:r>
-        <w:t xml:space="preserve">: roles to be confirmed by the authors.</w:t>
       </w:r>
     </w:p>
     <w:p>
@@ -2603,7 +2552,7 @@
         </w:numPr>
       </w:pPr>
       <w:r>
-        <w:t xml:space="preserve">Centers for Medicare &amp; Medicaid Services (2025, 2026).</w:t>
+        <w:t xml:space="preserve">Centers for Medicare &amp; Medicaid Services (2024, 2025).</w:t>
       </w:r>
       <w:r>
         <w:t xml:space="preserve"> </w:t>
@@ -2691,7 +2640,7 @@
         </w:numPr>
       </w:pPr>
       <w:r>
-        <w:t xml:space="preserve">Centers for Medicare &amp; Medicaid Services (2022, 2026).</w:t>
+        <w:t xml:space="preserve">Centers for Medicare &amp; Medicaid Services (2022, n.d.).</w:t>
       </w:r>
       <w:r>
         <w:t xml:space="preserve"> </w:t>
@@ -2810,7 +2759,7 @@
         </w:numPr>
       </w:pPr>
       <w:r>
-        <w:t xml:space="preserve">Congressional Research Service (2026).</w:t>
+        <w:t xml:space="preserve">Congressional Budget Office (2025).</w:t>
       </w:r>
       <w:r>
         <w:t xml:space="preserve"> </w:t>
@@ -2820,35 +2769,10 @@
           <w:i/>
           <w:iCs/>
         </w:rPr>
-        <w:t xml:space="preserve">Enhanced Premium Tax Credit and 2026 Exchange Premiums: Frequently Asked Questions</w:t>
-      </w:r>
-      <w:r>
-        <w:t xml:space="preserve">. Report R48290. Accessed 14 September 2026.</w:t>
-      </w:r>
-    </w:p>
-    <w:p>
-      <w:pPr>
-        <w:pStyle w:val="Compact"/>
-        <w:numPr>
-          <w:ilvl w:val="0"/>
-          <w:numId w:val="1001"/>
-        </w:numPr>
-      </w:pPr>
-      <w:r>
-        <w:t xml:space="preserve">Association of State and Territorial Health Officials (2026).</w:t>
-      </w:r>
-      <w:r>
-        <w:t xml:space="preserve"> </w:t>
-      </w:r>
-      <w:r>
-        <w:rPr>
-          <w:i/>
-          <w:iCs/>
-        </w:rPr>
-        <w:t xml:space="preserve">ACA Enhanced Premium Tax Credits: Legislative Developments in 2025 and 2026</w:t>
-      </w:r>
-      <w:r>
-        <w:t xml:space="preserve">. 20 January 2026. Accessed 14 September 2026.</w:t>
+        <w:t xml:space="preserve">The Estimated Effects of Enacting Selected Health Coverage Policies on the Federal Budget and on the Number of People With Health Insurance</w:t>
+      </w:r>
+      <w:r>
+        <w:t xml:space="preserve">. September 2025. https://www.cbo.gov/publication/61734</w:t>
       </w:r>
     </w:p>
     <w:p>

</xml_diff>

<commit_message>
Drop retrieval dates from references
</commit_message>
<xml_diff>
--- a/manuscript/Paper4_Babalola.docx
+++ b/manuscript/Paper4_Babalola.docx
@@ -2565,7 +2565,7 @@
         <w:t xml:space="preserve">Health Insurance Exchange Public Use Files: Rate and Plan Attributes</w:t>
       </w:r>
       <w:r>
-        <w:t xml:space="preserve">, plan years 2025 and 2026. Accessed September 2026.</w:t>
+        <w:t xml:space="preserve">, plan years 2025 and 2026.</w:t>
       </w:r>
     </w:p>
     <w:p>
@@ -2603,7 +2603,7 @@
         <w:t xml:space="preserve">Health Insurance Exchanges 2026 Open Enrollment Report</w:t>
       </w:r>
       <w:r>
-        <w:t xml:space="preserve">. Accessed September 2026.</w:t>
+        <w:t xml:space="preserve">.</w:t>
       </w:r>
     </w:p>
     <w:p>
@@ -2628,7 +2628,7 @@
         <w:t xml:space="preserve">Medical Loss Ratio Public Use Files</w:t>
       </w:r>
       <w:r>
-        <w:t xml:space="preserve">, reporting years 2021–2024. Accessed September 2026.</w:t>
+        <w:t xml:space="preserve">, reporting years 2021–2024.</w:t>
       </w:r>
     </w:p>
     <w:p>
@@ -2672,7 +2672,7 @@
         <w:t xml:space="preserve"> </w:t>
       </w:r>
       <w:r>
-        <w:t xml:space="preserve">(web page). Accessed 14 September 2026.</w:t>
+        <w:t xml:space="preserve">(web page).</w:t>
       </w:r>
     </w:p>
     <w:p>
@@ -2697,7 +2697,7 @@
         <w:t xml:space="preserve">Medical Expenditure Panel Survey Full-Year Consolidated Files</w:t>
       </w:r>
       <w:r>
-        <w:t xml:space="preserve">, 2019–2024. Accessed September 2026.</w:t>
+        <w:t xml:space="preserve">, 2019–2024.</w:t>
       </w:r>
     </w:p>
     <w:p>
@@ -2784,7 +2784,7 @@
           <w:i/>
           <w:iCs/>
         </w:rPr>
-        <w:t xml:space="preserve">DOIs for references 1 to 15 were verified against the Crossref REST API on 14 September 2026.</w:t>
+        <w:t xml:space="preserve">DOIs for references 1 to 15 were verified against the Crossref REST API.</w:t>
       </w:r>
     </w:p>
     <w:bookmarkEnd w:id="54"/>

</xml_diff>